<commit_message>
paper: add byline + AI-acknowledgment to the docx (match the repo's authorship)
The paper was anonymous -- title block ran straight to the abstract. Now carries
'Tomás Pavan' under the subtitle + a one-line acknowledgment naming both Claude
Opus 4.8 instances (claude.ai design; Claude Code build & analysis), matching
README + CONTRIBUTIONS. So the most-public artifact, read detached from the repo,
states who is accountable and that AI was involved. Body unchanged (refs + decider
table intact); doc reopens clean.

Co-Authored-By: Claude Opus 4.8 (1M context) <noreply@anthropic.com>
</commit_message>
<xml_diff>
--- a/paper/its-the-script-not-the-spell.docx
+++ b/paper/its-the-script-not-the-spell.docx
@@ -29,6 +29,28 @@
           <w:szCs w:val="24"/>
         </w:rPr>
         <w:t xml:space="preserve">A Voces-Negative Result on Deep Representation, and What Survives It</w:t>
+      </w:r>
+    </w:p>
+    <w:p>
+      <w:pPr/>
+      <w:r>
+        <w:rPr>
+          <w:rFonts w:ascii="Arial" w:hAnsi="Arial"/>
+          <w:b/>
+          <w:sz w:val="26"/>
+        </w:rPr>
+        <w:t>Tomás Pavan</w:t>
+      </w:r>
+    </w:p>
+    <w:p>
+      <w:pPr/>
+      <w:r>
+        <w:rPr>
+          <w:rFonts w:ascii="Arial" w:hAnsi="Arial"/>
+          <w:i/>
+          <w:sz w:val="18"/>
+        </w:rPr>
+        <w:t>Designed and analyzed in dialogue with two Claude Opus 4.8 instances (claude.ai — design; Claude Code — build &amp; analysis). The author is accountable; the AI collaboration is acknowledged, not authorship. See CONTRIBUTIONS.md and git history.</w:t>
       </w:r>
     </w:p>
     <w:p>

</xml_diff>